<commit_message>
Polish portfolio with cinematic motion and project visuals
</commit_message>
<xml_diff>
--- a/assets/Lalith_Alpuri_Resume.docx
+++ b/assets/Lalith_Alpuri_Resume.docx
@@ -39,7 +39,7 @@
         <w:rPr>
           <w:sz w:val="17"/>
         </w:rPr>
-        <w:t>Bengaluru, India  |  lalithalpuri.worl@gmail.com  |  +91 63038 38238  |  github.com/lalithbuilds  |  linkedin.com/in/lalith-alpuri</w:t>
+        <w:t>Bengaluru, India  |  lalithalpuri.worK@gmail.com  |  +91 63038 38238  |  github.com/lalithbuilds  |  linkedin.com/in/lalith-alpuri</w:t>
       </w:r>
     </w:p>
     <w:p>
@@ -56,7 +56,7 @@
         <w:spacing w:after="60"/>
       </w:pPr>
       <w:r>
-        <w:t>AI infrastructure engineer and applied AI strategist building local-first systems for coding agents and decision support. I work across Python, Java, MCP servers, SQLite memory, hybrid retrieval, multi-agent simulation, market intelligence, predictive analysis, and full-stack delivery. My public work includes EpisodAI, Episoda Core MCP, ALPURIS OS, and a personal Ray/UWOF local orchestration lab.</w:t>
+        <w:t>AI infrastructure engineer and applied AI strategist building local-first systems for coding agents and decision support. I work across Python, Java, MCP servers, SQLite memory, hybrid retrieval, multi-agent simulation, market intelligence, predictive analysis, and full-stack delivery. My public work includes EpisodAI, Episoda Core MCP, ALPURIS OS, and a personal Sentinel / UWOF local AI lab.</w:t>
       </w:r>
     </w:p>
     <w:p>
@@ -503,7 +503,7 @@
         <w:spacing w:after="20"/>
       </w:pPr>
       <w:r>
-        <w:t>Ray / UWOF local systems lab  |  Personal research project  |  2025–Present</w:t>
+        <w:t>Sentinel / UWOF local AI systems lab  |  Personal research project  |  2025–Present</w:t>
       </w:r>
     </w:p>
     <w:p>

</xml_diff>

<commit_message>
Add verified Oracle certifications and badges to resume
</commit_message>
<xml_diff>
--- a/assets/Lalith_Alpuri_Resume.docx
+++ b/assets/Lalith_Alpuri_Resume.docx
@@ -603,6 +603,181 @@
     <w:p>
       <w:pPr>
         <w:pStyle w:val="Heading1"/>
+      </w:pPr>
+      <w:r>
+        <w:t>ORACLE CERTIFICATIONS</w:t>
+      </w:r>
+    </w:p>
+    <w:tbl>
+      <w:tblPr>
+        <w:tblW w:type="auto" w:w="0"/>
+        <w:tblLayout w:type="fixed"/>
+        <w:tblLook w:firstColumn="1" w:firstRow="1" w:lastColumn="0" w:lastRow="0" w:noHBand="0" w:noVBand="1" w:val="04A0"/>
+      </w:tblPr>
+      <w:tblGrid>
+        <w:gridCol w:w="2088"/>
+        <w:gridCol w:w="7632"/>
+      </w:tblGrid>
+      <w:tr>
+        <w:tc>
+          <w:tcPr>
+            <w:tcW w:type="dxa" w:w="2088"/>
+          </w:tcPr>
+          <w:p>
+            <w:r>
+              <w:rPr>
+                <w:sz w:val="18"/>
+              </w:rPr>
+              <w:drawing>
+                <wp:inline xmlns:a="http://schemas.openxmlformats.org/drawingml/2006/main" xmlns:pic="http://schemas.openxmlformats.org/drawingml/2006/picture">
+                  <wp:extent cx="1280160" cy="640080"/>
+                  <wp:docPr id="1" name="Picture 1"/>
+                  <wp:cNvGraphicFramePr>
+                    <a:graphicFrameLocks noChangeAspect="1"/>
+                  </wp:cNvGraphicFramePr>
+                  <a:graphic>
+                    <a:graphicData uri="http://schemas.openxmlformats.org/drawingml/2006/picture">
+                      <pic:pic>
+                        <pic:nvPicPr>
+                          <pic:cNvPr id="0" name="oracle-fusion-ai-agent-studio.jpg"/>
+                          <pic:cNvPicPr/>
+                        </pic:nvPicPr>
+                        <pic:blipFill>
+                          <a:blip r:embed="rId9"/>
+                          <a:stretch>
+                            <a:fillRect/>
+                          </a:stretch>
+                        </pic:blipFill>
+                        <pic:spPr>
+                          <a:xfrm>
+                            <a:off x="0" y="0"/>
+                            <a:ext cx="1280160" cy="640080"/>
+                          </a:xfrm>
+                          <a:prstGeom prst="rect"/>
+                        </pic:spPr>
+                      </pic:pic>
+                    </a:graphicData>
+                  </a:graphic>
+                </wp:inline>
+              </w:drawing>
+            </w:r>
+          </w:p>
+        </w:tc>
+        <w:tc>
+          <w:tcPr>
+            <w:tcW w:type="dxa" w:w="7632"/>
+          </w:tcPr>
+          <w:p>
+            <w:r>
+              <w:rPr>
+                <w:b/>
+                <w:sz w:val="18"/>
+              </w:rPr>
+              <w:t>Oracle Fusion AI Agent Studio Certified Foundations Associate - Rel 1</w:t>
+            </w:r>
+            <w:r>
+              <w:rPr>
+                <w:sz w:val="18"/>
+              </w:rPr>
+              <w:br/>
+              <w:t>Oracle · Exam 1Z0-1145-1</w:t>
+              <w:br/>
+              <w:t>Issued October 16, 2026</w:t>
+              <w:br/>
+            </w:r>
+            <w:hyperlink r:id="rId10">
+              <w:r>
+                <w:rPr>
+                  <w:color w:val="245A81"/>
+                </w:rPr>
+                <w:t>Verify Oracle credential</w:t>
+              </w:r>
+            </w:hyperlink>
+          </w:p>
+        </w:tc>
+      </w:tr>
+      <w:tr>
+        <w:tc>
+          <w:tcPr>
+            <w:tcW w:type="dxa" w:w="2088"/>
+          </w:tcPr>
+          <w:p>
+            <w:r>
+              <w:rPr>
+                <w:sz w:val="18"/>
+              </w:rPr>
+              <w:drawing>
+                <wp:inline xmlns:a="http://schemas.openxmlformats.org/drawingml/2006/main" xmlns:pic="http://schemas.openxmlformats.org/drawingml/2006/picture">
+                  <wp:extent cx="1280160" cy="640080"/>
+                  <wp:docPr id="2" name="Picture 2"/>
+                  <wp:cNvGraphicFramePr>
+                    <a:graphicFrameLocks noChangeAspect="1"/>
+                  </wp:cNvGraphicFramePr>
+                  <a:graphic>
+                    <a:graphicData uri="http://schemas.openxmlformats.org/drawingml/2006/picture">
+                      <pic:pic>
+                        <pic:nvPicPr>
+                          <pic:cNvPr id="0" name="oracle-oci-foundations-2026.jpg"/>
+                          <pic:cNvPicPr/>
+                        </pic:nvPicPr>
+                        <pic:blipFill>
+                          <a:blip r:embed="rId11"/>
+                          <a:stretch>
+                            <a:fillRect/>
+                          </a:stretch>
+                        </pic:blipFill>
+                        <pic:spPr>
+                          <a:xfrm>
+                            <a:off x="0" y="0"/>
+                            <a:ext cx="1280160" cy="640080"/>
+                          </a:xfrm>
+                          <a:prstGeom prst="rect"/>
+                        </pic:spPr>
+                      </pic:pic>
+                    </a:graphicData>
+                  </a:graphic>
+                </wp:inline>
+              </w:drawing>
+            </w:r>
+          </w:p>
+        </w:tc>
+        <w:tc>
+          <w:tcPr>
+            <w:tcW w:type="dxa" w:w="7632"/>
+          </w:tcPr>
+          <w:p>
+            <w:r>
+              <w:rPr>
+                <w:b/>
+                <w:sz w:val="18"/>
+              </w:rPr>
+              <w:t>Oracle Cloud Infrastructure Certified Foundations Associate</w:t>
+            </w:r>
+            <w:r>
+              <w:rPr>
+                <w:sz w:val="18"/>
+              </w:rPr>
+              <w:br/>
+              <w:t>Oracle · Exam 1Z0-1085-26</w:t>
+              <w:br/>
+              <w:t>Issued October 16, 2026 · Valid until October 16, 2028</w:t>
+              <w:br/>
+            </w:r>
+            <w:hyperlink r:id="rId12">
+              <w:r>
+                <w:rPr>
+                  <w:color w:val="245A81"/>
+                </w:rPr>
+                <w:t>Verify Oracle credential</w:t>
+              </w:r>
+            </w:hyperlink>
+          </w:p>
+        </w:tc>
+      </w:tr>
+    </w:tbl>
+    <w:p>
+      <w:pPr>
+        <w:pStyle w:val="Heading1"/>
         <w:spacing w:before="140" w:after="40"/>
       </w:pPr>
       <w:r>

</xml_diff>

<commit_message>
Add Deloitte Forage Cyber completion certificate to resume
</commit_message>
<xml_diff>
--- a/assets/Lalith_Alpuri_Resume.docx
+++ b/assets/Lalith_Alpuri_Resume.docx
@@ -778,6 +778,36 @@
     <w:p>
       <w:pPr>
         <w:pStyle w:val="Heading1"/>
+      </w:pPr>
+      <w:r>
+        <w:t>JOB SIMULATION CERTIFICATES</w:t>
+      </w:r>
+    </w:p>
+    <w:p>
+      <w:r>
+        <w:rPr>
+          <w:b/>
+        </w:rPr>
+        <w:t>Cyber Job Simulation | Deloitte · Forage</w:t>
+      </w:r>
+    </w:p>
+    <w:p>
+      <w:r>
+        <w:t>Certificate of Completion · October 16, 2026</w:t>
+        <w:br/>
+        <w:t>Completed practical tasks in cyber security. Issued by Forage.</w:t>
+      </w:r>
+    </w:p>
+    <w:p>
+      <w:hyperlink r:id="rId13">
+        <w:r>
+          <w:t>View completion certificate</w:t>
+        </w:r>
+      </w:hyperlink>
+    </w:p>
+    <w:p>
+      <w:pPr>
+        <w:pStyle w:val="Heading1"/>
         <w:spacing w:before="140" w:after="40"/>
       </w:pPr>
       <w:r>

</xml_diff>

<commit_message>
Add Claude Academy and Forage credentials to portfolio and resume
</commit_message>
<xml_diff>
--- a/assets/Lalith_Alpuri_Resume.docx
+++ b/assets/Lalith_Alpuri_Resume.docx
@@ -603,211 +603,6 @@
     <w:p>
       <w:pPr>
         <w:pStyle w:val="Heading1"/>
-      </w:pPr>
-      <w:r>
-        <w:t>ORACLE CERTIFICATIONS</w:t>
-      </w:r>
-    </w:p>
-    <w:tbl>
-      <w:tblPr>
-        <w:tblW w:type="auto" w:w="0"/>
-        <w:tblLayout w:type="fixed"/>
-        <w:tblLook w:firstColumn="1" w:firstRow="1" w:lastColumn="0" w:lastRow="0" w:noHBand="0" w:noVBand="1" w:val="04A0"/>
-      </w:tblPr>
-      <w:tblGrid>
-        <w:gridCol w:w="2088"/>
-        <w:gridCol w:w="7632"/>
-      </w:tblGrid>
-      <w:tr>
-        <w:tc>
-          <w:tcPr>
-            <w:tcW w:type="dxa" w:w="2088"/>
-          </w:tcPr>
-          <w:p>
-            <w:r>
-              <w:rPr>
-                <w:sz w:val="18"/>
-              </w:rPr>
-              <w:drawing>
-                <wp:inline xmlns:a="http://schemas.openxmlformats.org/drawingml/2006/main" xmlns:pic="http://schemas.openxmlformats.org/drawingml/2006/picture">
-                  <wp:extent cx="1280160" cy="640080"/>
-                  <wp:docPr id="1" name="Picture 1"/>
-                  <wp:cNvGraphicFramePr>
-                    <a:graphicFrameLocks noChangeAspect="1"/>
-                  </wp:cNvGraphicFramePr>
-                  <a:graphic>
-                    <a:graphicData uri="http://schemas.openxmlformats.org/drawingml/2006/picture">
-                      <pic:pic>
-                        <pic:nvPicPr>
-                          <pic:cNvPr id="0" name="oracle-fusion-ai-agent-studio.jpg"/>
-                          <pic:cNvPicPr/>
-                        </pic:nvPicPr>
-                        <pic:blipFill>
-                          <a:blip r:embed="rId9"/>
-                          <a:stretch>
-                            <a:fillRect/>
-                          </a:stretch>
-                        </pic:blipFill>
-                        <pic:spPr>
-                          <a:xfrm>
-                            <a:off x="0" y="0"/>
-                            <a:ext cx="1280160" cy="640080"/>
-                          </a:xfrm>
-                          <a:prstGeom prst="rect"/>
-                        </pic:spPr>
-                      </pic:pic>
-                    </a:graphicData>
-                  </a:graphic>
-                </wp:inline>
-              </w:drawing>
-            </w:r>
-          </w:p>
-        </w:tc>
-        <w:tc>
-          <w:tcPr>
-            <w:tcW w:type="dxa" w:w="7632"/>
-          </w:tcPr>
-          <w:p>
-            <w:r>
-              <w:rPr>
-                <w:b/>
-                <w:sz w:val="18"/>
-              </w:rPr>
-              <w:t>Oracle Fusion AI Agent Studio Certified Foundations Associate - Rel 1</w:t>
-            </w:r>
-            <w:r>
-              <w:rPr>
-                <w:sz w:val="18"/>
-              </w:rPr>
-              <w:br/>
-              <w:t>Oracle · Exam 1Z0-1145-1</w:t>
-              <w:br/>
-              <w:t>Issued October 16, 2026</w:t>
-              <w:br/>
-            </w:r>
-            <w:hyperlink r:id="rId10">
-              <w:r>
-                <w:rPr>
-                  <w:color w:val="245A81"/>
-                </w:rPr>
-                <w:t>Verify Oracle credential</w:t>
-              </w:r>
-            </w:hyperlink>
-          </w:p>
-        </w:tc>
-      </w:tr>
-      <w:tr>
-        <w:tc>
-          <w:tcPr>
-            <w:tcW w:type="dxa" w:w="2088"/>
-          </w:tcPr>
-          <w:p>
-            <w:r>
-              <w:rPr>
-                <w:sz w:val="18"/>
-              </w:rPr>
-              <w:drawing>
-                <wp:inline xmlns:a="http://schemas.openxmlformats.org/drawingml/2006/main" xmlns:pic="http://schemas.openxmlformats.org/drawingml/2006/picture">
-                  <wp:extent cx="1280160" cy="640080"/>
-                  <wp:docPr id="2" name="Picture 2"/>
-                  <wp:cNvGraphicFramePr>
-                    <a:graphicFrameLocks noChangeAspect="1"/>
-                  </wp:cNvGraphicFramePr>
-                  <a:graphic>
-                    <a:graphicData uri="http://schemas.openxmlformats.org/drawingml/2006/picture">
-                      <pic:pic>
-                        <pic:nvPicPr>
-                          <pic:cNvPr id="0" name="oracle-oci-foundations-2026.jpg"/>
-                          <pic:cNvPicPr/>
-                        </pic:nvPicPr>
-                        <pic:blipFill>
-                          <a:blip r:embed="rId11"/>
-                          <a:stretch>
-                            <a:fillRect/>
-                          </a:stretch>
-                        </pic:blipFill>
-                        <pic:spPr>
-                          <a:xfrm>
-                            <a:off x="0" y="0"/>
-                            <a:ext cx="1280160" cy="640080"/>
-                          </a:xfrm>
-                          <a:prstGeom prst="rect"/>
-                        </pic:spPr>
-                      </pic:pic>
-                    </a:graphicData>
-                  </a:graphic>
-                </wp:inline>
-              </w:drawing>
-            </w:r>
-          </w:p>
-        </w:tc>
-        <w:tc>
-          <w:tcPr>
-            <w:tcW w:type="dxa" w:w="7632"/>
-          </w:tcPr>
-          <w:p>
-            <w:r>
-              <w:rPr>
-                <w:b/>
-                <w:sz w:val="18"/>
-              </w:rPr>
-              <w:t>Oracle Cloud Infrastructure Certified Foundations Associate</w:t>
-            </w:r>
-            <w:r>
-              <w:rPr>
-                <w:sz w:val="18"/>
-              </w:rPr>
-              <w:br/>
-              <w:t>Oracle · Exam 1Z0-1085-26</w:t>
-              <w:br/>
-              <w:t>Issued October 16, 2026 · Valid until October 16, 2028</w:t>
-              <w:br/>
-            </w:r>
-            <w:hyperlink r:id="rId12">
-              <w:r>
-                <w:rPr>
-                  <w:color w:val="245A81"/>
-                </w:rPr>
-                <w:t>Verify Oracle credential</w:t>
-              </w:r>
-            </w:hyperlink>
-          </w:p>
-        </w:tc>
-      </w:tr>
-    </w:tbl>
-    <w:p>
-      <w:pPr>
-        <w:pStyle w:val="Heading1"/>
-      </w:pPr>
-      <w:r>
-        <w:t>JOB SIMULATION CERTIFICATES</w:t>
-      </w:r>
-    </w:p>
-    <w:p>
-      <w:r>
-        <w:rPr>
-          <w:b/>
-        </w:rPr>
-        <w:t>Cyber Job Simulation | Deloitte · Forage</w:t>
-      </w:r>
-    </w:p>
-    <w:p>
-      <w:r>
-        <w:t>Certificate of Completion · October 16, 2026</w:t>
-        <w:br/>
-        <w:t>Completed practical tasks in cyber security. Issued by Forage.</w:t>
-      </w:r>
-    </w:p>
-    <w:p>
-      <w:hyperlink r:id="rId13">
-        <w:r>
-          <w:t>View completion certificate</w:t>
-        </w:r>
-      </w:hyperlink>
-    </w:p>
-    <w:p>
-      <w:pPr>
-        <w:pStyle w:val="Heading1"/>
         <w:spacing w:before="140" w:after="40"/>
       </w:pPr>
       <w:r>
@@ -864,6 +659,665 @@
       <w:r>
         <w:t>GitHub: https://github.com/lalithbuilds  ·  Project home: https://lalithbuilds.github.io/  ·  LinkedIn: https://www.linkedin.com/in/lalith-alpuri/</w:t>
       </w:r>
+    </w:p>
+    <w:p>
+      <w:pPr>
+        <w:pStyle w:val="Heading1"/>
+        <w:keepNext/>
+        <w:pageBreakBefore/>
+      </w:pPr>
+      <w:r>
+        <w:t>CERTIFICATIONS &amp; CREDENTIALS</w:t>
+      </w:r>
+    </w:p>
+    <w:p>
+      <w:pPr>
+        <w:spacing w:after="140"/>
+      </w:pPr>
+      <w:r>
+        <w:t>Issued to Naga Lalith Chandra Alpuri · October 16, 2026</w:t>
+      </w:r>
+    </w:p>
+    <w:p>
+      <w:pPr>
+        <w:pStyle w:val="Heading2"/>
+      </w:pPr>
+      <w:r>
+        <w:t>Oracle certifications</w:t>
+      </w:r>
+    </w:p>
+    <w:tbl>
+      <w:tblPr>
+        <w:tblW w:type="auto" w:w="0"/>
+        <w:tblLayout w:type="fixed"/>
+        <w:tblLook w:firstColumn="1" w:firstRow="1" w:lastColumn="0" w:lastRow="0" w:noHBand="0" w:noVBand="1" w:val="04A0"/>
+      </w:tblPr>
+      <w:tblGrid>
+        <w:gridCol w:w="1800"/>
+        <w:gridCol w:w="8712"/>
+      </w:tblGrid>
+      <w:tr>
+        <w:trPr>
+          <w:cantSplit/>
+        </w:trPr>
+        <w:tc>
+          <w:tcPr>
+            <w:tcW w:type="dxa" w:w="1800"/>
+          </w:tcPr>
+          <w:p>
+            <w:pPr>
+              <w:keepLines/>
+              <w:spacing w:after="80"/>
+            </w:pPr>
+            <w:r>
+              <w:rPr>
+                <w:sz w:val="18"/>
+              </w:rPr>
+              <w:drawing>
+                <wp:inline xmlns:a="http://schemas.openxmlformats.org/drawingml/2006/main" xmlns:pic="http://schemas.openxmlformats.org/drawingml/2006/picture">
+                  <wp:extent cx="1051560" cy="525780"/>
+                  <wp:docPr id="1" name="Picture 1"/>
+                  <wp:cNvGraphicFramePr>
+                    <a:graphicFrameLocks noChangeAspect="1"/>
+                  </wp:cNvGraphicFramePr>
+                  <a:graphic>
+                    <a:graphicData uri="http://schemas.openxmlformats.org/drawingml/2006/picture">
+                      <pic:pic>
+                        <pic:nvPicPr>
+                          <pic:cNvPr id="0" name="image.jpg"/>
+                          <pic:cNvPicPr/>
+                        </pic:nvPicPr>
+                        <pic:blipFill>
+                          <a:blip r:embed="rId9"/>
+                          <a:stretch>
+                            <a:fillRect/>
+                          </a:stretch>
+                        </pic:blipFill>
+                        <pic:spPr>
+                          <a:xfrm>
+                            <a:off x="0" y="0"/>
+                            <a:ext cx="1051560" cy="525780"/>
+                          </a:xfrm>
+                          <a:prstGeom prst="rect"/>
+                        </pic:spPr>
+                      </pic:pic>
+                    </a:graphicData>
+                  </a:graphic>
+                </wp:inline>
+              </w:drawing>
+            </w:r>
+          </w:p>
+        </w:tc>
+        <w:tc>
+          <w:tcPr>
+            <w:tcW w:type="dxa" w:w="8712"/>
+          </w:tcPr>
+          <w:p>
+            <w:pPr>
+              <w:keepLines/>
+              <w:spacing w:after="80"/>
+            </w:pPr>
+            <w:r>
+              <w:rPr>
+                <w:b/>
+                <w:sz w:val="18"/>
+              </w:rPr>
+              <w:t>Oracle Fusion AI Agent Studio Certified Foundations Associate - Rel 1</w:t>
+            </w:r>
+            <w:r>
+              <w:rPr>
+                <w:sz w:val="18"/>
+              </w:rPr>
+              <w:br/>
+              <w:t>Oracle · Exam 1Z0-1145-1</w:t>
+              <w:br/>
+              <w:t>Issued October 16, 2026</w:t>
+              <w:br/>
+            </w:r>
+            <w:hyperlink r:id="rId10">
+              <w:r>
+                <w:rPr>
+                  <w:color w:val="245A81"/>
+                  <w:sz w:val="17"/>
+                </w:rPr>
+                <w:t>Verify credential</w:t>
+              </w:r>
+            </w:hyperlink>
+            <w:r>
+              <w:rPr>
+                <w:sz w:val="18"/>
+              </w:rPr>
+              <w:t xml:space="preserve">  |  </w:t>
+            </w:r>
+            <w:hyperlink r:id="rId14">
+              <w:r>
+                <w:rPr>
+                  <w:color w:val="245A81"/>
+                  <w:sz w:val="17"/>
+                </w:rPr>
+                <w:t>View PDF</w:t>
+              </w:r>
+            </w:hyperlink>
+          </w:p>
+        </w:tc>
+      </w:tr>
+      <w:tr>
+        <w:trPr>
+          <w:cantSplit/>
+        </w:trPr>
+        <w:tc>
+          <w:tcPr>
+            <w:tcW w:type="dxa" w:w="1800"/>
+          </w:tcPr>
+          <w:p>
+            <w:pPr>
+              <w:keepLines/>
+              <w:spacing w:after="80"/>
+            </w:pPr>
+            <w:r>
+              <w:rPr>
+                <w:sz w:val="18"/>
+              </w:rPr>
+              <w:drawing>
+                <wp:inline xmlns:a="http://schemas.openxmlformats.org/drawingml/2006/main" xmlns:pic="http://schemas.openxmlformats.org/drawingml/2006/picture">
+                  <wp:extent cx="1051560" cy="525780"/>
+                  <wp:docPr id="2" name="Picture 2"/>
+                  <wp:cNvGraphicFramePr>
+                    <a:graphicFrameLocks noChangeAspect="1"/>
+                  </wp:cNvGraphicFramePr>
+                  <a:graphic>
+                    <a:graphicData uri="http://schemas.openxmlformats.org/drawingml/2006/picture">
+                      <pic:pic>
+                        <pic:nvPicPr>
+                          <pic:cNvPr id="0" name="image.jpg"/>
+                          <pic:cNvPicPr/>
+                        </pic:nvPicPr>
+                        <pic:blipFill>
+                          <a:blip r:embed="rId11"/>
+                          <a:stretch>
+                            <a:fillRect/>
+                          </a:stretch>
+                        </pic:blipFill>
+                        <pic:spPr>
+                          <a:xfrm>
+                            <a:off x="0" y="0"/>
+                            <a:ext cx="1051560" cy="525780"/>
+                          </a:xfrm>
+                          <a:prstGeom prst="rect"/>
+                        </pic:spPr>
+                      </pic:pic>
+                    </a:graphicData>
+                  </a:graphic>
+                </wp:inline>
+              </w:drawing>
+            </w:r>
+          </w:p>
+        </w:tc>
+        <w:tc>
+          <w:tcPr>
+            <w:tcW w:type="dxa" w:w="8712"/>
+          </w:tcPr>
+          <w:p>
+            <w:pPr>
+              <w:keepLines/>
+              <w:spacing w:after="80"/>
+            </w:pPr>
+            <w:r>
+              <w:rPr>
+                <w:b/>
+                <w:sz w:val="18"/>
+              </w:rPr>
+              <w:t>Oracle Cloud Infrastructure Certified Foundations Associate</w:t>
+            </w:r>
+            <w:r>
+              <w:rPr>
+                <w:sz w:val="18"/>
+              </w:rPr>
+              <w:br/>
+              <w:t>Oracle · Exam 1Z0-1085-26</w:t>
+              <w:br/>
+              <w:t>Issued October 16, 2026 · Valid until October 16, 2028</w:t>
+              <w:br/>
+            </w:r>
+            <w:hyperlink r:id="rId12">
+              <w:r>
+                <w:rPr>
+                  <w:color w:val="245A81"/>
+                  <w:sz w:val="17"/>
+                </w:rPr>
+                <w:t>Verify credential</w:t>
+              </w:r>
+            </w:hyperlink>
+            <w:r>
+              <w:rPr>
+                <w:sz w:val="18"/>
+              </w:rPr>
+              <w:t xml:space="preserve">  |  </w:t>
+            </w:r>
+            <w:hyperlink r:id="rId15">
+              <w:r>
+                <w:rPr>
+                  <w:color w:val="245A81"/>
+                  <w:sz w:val="17"/>
+                </w:rPr>
+                <w:t>View PDF</w:t>
+              </w:r>
+            </w:hyperlink>
+          </w:p>
+        </w:tc>
+      </w:tr>
+    </w:tbl>
+    <w:p>
+      <w:pPr>
+        <w:pStyle w:val="Heading2"/>
+      </w:pPr>
+      <w:r>
+        <w:t>Claude Academy course completion badges</w:t>
+      </w:r>
+    </w:p>
+    <w:tbl>
+      <w:tblPr>
+        <w:tblW w:type="auto" w:w="0"/>
+        <w:tblLayout w:type="fixed"/>
+        <w:tblLook w:firstColumn="1" w:firstRow="1" w:lastColumn="0" w:lastRow="0" w:noHBand="0" w:noVBand="1" w:val="04A0"/>
+      </w:tblPr>
+      <w:tblGrid>
+        <w:gridCol w:w="1800"/>
+        <w:gridCol w:w="8712"/>
+      </w:tblGrid>
+      <w:tr>
+        <w:trPr>
+          <w:cantSplit/>
+        </w:trPr>
+        <w:tc>
+          <w:tcPr>
+            <w:tcW w:type="dxa" w:w="1800"/>
+          </w:tcPr>
+          <w:p>
+            <w:pPr>
+              <w:keepLines/>
+              <w:spacing w:after="80"/>
+            </w:pPr>
+            <w:r>
+              <w:rPr>
+                <w:sz w:val="18"/>
+              </w:rPr>
+              <w:drawing>
+                <wp:inline xmlns:a="http://schemas.openxmlformats.org/drawingml/2006/main" xmlns:pic="http://schemas.openxmlformats.org/drawingml/2006/picture">
+                  <wp:extent cx="1051560" cy="770507"/>
+                  <wp:docPr id="3" name="Picture 3"/>
+                  <wp:cNvGraphicFramePr>
+                    <a:graphicFrameLocks noChangeAspect="1"/>
+                  </wp:cNvGraphicFramePr>
+                  <a:graphic>
+                    <a:graphicData uri="http://schemas.openxmlformats.org/drawingml/2006/picture">
+                      <pic:pic>
+                        <pic:nvPicPr>
+                          <pic:cNvPr id="0" name="claude-ai-fluency-for-builders.jpg"/>
+                          <pic:cNvPicPr/>
+                        </pic:nvPicPr>
+                        <pic:blipFill>
+                          <a:blip r:embed="rId16"/>
+                          <a:stretch>
+                            <a:fillRect/>
+                          </a:stretch>
+                        </pic:blipFill>
+                        <pic:spPr>
+                          <a:xfrm>
+                            <a:off x="0" y="0"/>
+                            <a:ext cx="1051560" cy="770507"/>
+                          </a:xfrm>
+                          <a:prstGeom prst="rect"/>
+                        </pic:spPr>
+                      </pic:pic>
+                    </a:graphicData>
+                  </a:graphic>
+                </wp:inline>
+              </w:drawing>
+            </w:r>
+          </w:p>
+        </w:tc>
+        <w:tc>
+          <w:tcPr>
+            <w:tcW w:type="dxa" w:w="8712"/>
+          </w:tcPr>
+          <w:p>
+            <w:pPr>
+              <w:keepLines/>
+              <w:spacing w:after="80"/>
+            </w:pPr>
+            <w:r>
+              <w:rPr>
+                <w:b/>
+                <w:sz w:val="18"/>
+              </w:rPr>
+              <w:t>AI Fluency for Builders</w:t>
+            </w:r>
+            <w:r>
+              <w:rPr>
+                <w:sz w:val="18"/>
+              </w:rPr>
+              <w:br/>
+              <w:t>Claude Academy · Course completion badge</w:t>
+              <w:br/>
+              <w:t>Issued October 16, 2026</w:t>
+              <w:br/>
+            </w:r>
+            <w:hyperlink r:id="rId17">
+              <w:r>
+                <w:rPr>
+                  <w:color w:val="245A81"/>
+                  <w:sz w:val="17"/>
+                </w:rPr>
+                <w:t>Verify badge</w:t>
+              </w:r>
+            </w:hyperlink>
+            <w:r>
+              <w:rPr>
+                <w:sz w:val="18"/>
+              </w:rPr>
+              <w:t xml:space="preserve">  |  </w:t>
+            </w:r>
+            <w:hyperlink r:id="rId18">
+              <w:r>
+                <w:rPr>
+                  <w:color w:val="245A81"/>
+                  <w:sz w:val="17"/>
+                </w:rPr>
+                <w:t>View PDF</w:t>
+              </w:r>
+            </w:hyperlink>
+          </w:p>
+        </w:tc>
+      </w:tr>
+      <w:tr>
+        <w:trPr>
+          <w:cantSplit/>
+        </w:trPr>
+        <w:tc>
+          <w:tcPr>
+            <w:tcW w:type="dxa" w:w="1800"/>
+          </w:tcPr>
+          <w:p>
+            <w:pPr>
+              <w:keepLines/>
+              <w:spacing w:after="80"/>
+            </w:pPr>
+            <w:r>
+              <w:rPr>
+                <w:sz w:val="18"/>
+              </w:rPr>
+              <w:drawing>
+                <wp:inline xmlns:a="http://schemas.openxmlformats.org/drawingml/2006/main" xmlns:pic="http://schemas.openxmlformats.org/drawingml/2006/picture">
+                  <wp:extent cx="1051560" cy="770507"/>
+                  <wp:docPr id="4" name="Picture 4"/>
+                  <wp:cNvGraphicFramePr>
+                    <a:graphicFrameLocks noChangeAspect="1"/>
+                  </wp:cNvGraphicFramePr>
+                  <a:graphic>
+                    <a:graphicData uri="http://schemas.openxmlformats.org/drawingml/2006/picture">
+                      <pic:pic>
+                        <pic:nvPicPr>
+                          <pic:cNvPr id="0" name="claude-building-with-the-api.jpg"/>
+                          <pic:cNvPicPr/>
+                        </pic:nvPicPr>
+                        <pic:blipFill>
+                          <a:blip r:embed="rId19"/>
+                          <a:stretch>
+                            <a:fillRect/>
+                          </a:stretch>
+                        </pic:blipFill>
+                        <pic:spPr>
+                          <a:xfrm>
+                            <a:off x="0" y="0"/>
+                            <a:ext cx="1051560" cy="770507"/>
+                          </a:xfrm>
+                          <a:prstGeom prst="rect"/>
+                        </pic:spPr>
+                      </pic:pic>
+                    </a:graphicData>
+                  </a:graphic>
+                </wp:inline>
+              </w:drawing>
+            </w:r>
+          </w:p>
+        </w:tc>
+        <w:tc>
+          <w:tcPr>
+            <w:tcW w:type="dxa" w:w="8712"/>
+          </w:tcPr>
+          <w:p>
+            <w:pPr>
+              <w:keepLines/>
+              <w:spacing w:after="80"/>
+            </w:pPr>
+            <w:r>
+              <w:rPr>
+                <w:b/>
+                <w:sz w:val="18"/>
+              </w:rPr>
+              <w:t>Building with the Claude API</w:t>
+            </w:r>
+            <w:r>
+              <w:rPr>
+                <w:sz w:val="18"/>
+              </w:rPr>
+              <w:br/>
+              <w:t>Claude Academy · Course completion badge</w:t>
+              <w:br/>
+              <w:t>Issued October 16, 2026</w:t>
+              <w:br/>
+            </w:r>
+            <w:hyperlink r:id="rId20">
+              <w:r>
+                <w:rPr>
+                  <w:color w:val="245A81"/>
+                  <w:sz w:val="17"/>
+                </w:rPr>
+                <w:t>Verify badge</w:t>
+              </w:r>
+            </w:hyperlink>
+            <w:r>
+              <w:rPr>
+                <w:sz w:val="18"/>
+              </w:rPr>
+              <w:t xml:space="preserve">  |  </w:t>
+            </w:r>
+            <w:hyperlink r:id="rId21">
+              <w:r>
+                <w:rPr>
+                  <w:color w:val="245A81"/>
+                  <w:sz w:val="17"/>
+                </w:rPr>
+                <w:t>View PDF</w:t>
+              </w:r>
+            </w:hyperlink>
+          </w:p>
+        </w:tc>
+      </w:tr>
+    </w:tbl>
+    <w:p>
+      <w:pPr>
+        <w:pStyle w:val="Heading2"/>
+      </w:pPr>
+      <w:r>
+        <w:t>Industry job simulation certificates · Forage</w:t>
+      </w:r>
+    </w:p>
+    <w:p>
+      <w:pPr>
+        <w:keepNext/>
+        <w:spacing w:after="20"/>
+      </w:pPr>
+      <w:r>
+        <w:rPr>
+          <w:b/>
+        </w:rPr>
+        <w:t>GenAI Job Simulation | BCG X · Forage</w:t>
+      </w:r>
+    </w:p>
+    <w:p>
+      <w:pPr>
+        <w:keepLines/>
+        <w:spacing w:after="120"/>
+      </w:pPr>
+      <w:r>
+        <w:rPr>
+          <w:sz w:val="18"/>
+        </w:rPr>
+        <w:t>Certificate of Completion · October 16, 2026</w:t>
+        <w:br/>
+        <w:t xml:space="preserve">Data extraction and initial analysis; developing an AI-powered financial chatbot. </w:t>
+      </w:r>
+      <w:hyperlink r:id="rId22">
+        <w:r>
+          <w:rPr>
+            <w:color w:val="245A81"/>
+            <w:sz w:val="17"/>
+          </w:rPr>
+          <w:t>View certificate</w:t>
+        </w:r>
+      </w:hyperlink>
+    </w:p>
+    <w:p>
+      <w:pPr>
+        <w:keepNext/>
+        <w:spacing w:after="20"/>
+      </w:pPr>
+      <w:r>
+        <w:rPr>
+          <w:b/>
+        </w:rPr>
+        <w:t>AI in Action Job Simulation | Vista Equity Partners · Forage</w:t>
+      </w:r>
+    </w:p>
+    <w:p>
+      <w:pPr>
+        <w:keepLines/>
+        <w:spacing w:after="120"/>
+      </w:pPr>
+      <w:r>
+        <w:rPr>
+          <w:sz w:val="18"/>
+        </w:rPr>
+        <w:t>Certificate of Completion · October 16, 2026</w:t>
+        <w:br/>
+        <w:t xml:space="preserve">Prompt and contextual engineering; automating a professional workflow. </w:t>
+      </w:r>
+      <w:hyperlink r:id="rId23">
+        <w:r>
+          <w:rPr>
+            <w:color w:val="245A81"/>
+            <w:sz w:val="17"/>
+          </w:rPr>
+          <w:t>View certificate</w:t>
+        </w:r>
+      </w:hyperlink>
+    </w:p>
+    <w:p>
+      <w:pPr>
+        <w:keepNext/>
+        <w:spacing w:after="20"/>
+      </w:pPr>
+      <w:r>
+        <w:rPr>
+          <w:b/>
+        </w:rPr>
+        <w:t>Automation AI Accelerator: From Co-pilot to Autonomous Agent Job Simulation | Datacom · Forage</w:t>
+      </w:r>
+    </w:p>
+    <w:p>
+      <w:pPr>
+        <w:keepLines/>
+        <w:spacing w:after="120"/>
+      </w:pPr>
+      <w:r>
+        <w:rPr>
+          <w:sz w:val="18"/>
+        </w:rPr>
+        <w:t>Certificate of Completion · October 16, 2026</w:t>
+        <w:br/>
+        <w:t xml:space="preserve">AI-powered debugging and refactoring; process-flow design. </w:t>
+      </w:r>
+      <w:hyperlink r:id="rId24">
+        <w:r>
+          <w:rPr>
+            <w:color w:val="245A81"/>
+            <w:sz w:val="17"/>
+          </w:rPr>
+          <w:t>View certificate</w:t>
+        </w:r>
+      </w:hyperlink>
+    </w:p>
+    <w:p>
+      <w:pPr>
+        <w:keepNext/>
+        <w:spacing w:after="20"/>
+      </w:pPr>
+      <w:r>
+        <w:rPr>
+          <w:b/>
+        </w:rPr>
+        <w:t>GenAI for Proposal Generation Job Simulation | EAB · Forage</w:t>
+      </w:r>
+    </w:p>
+    <w:p>
+      <w:pPr>
+        <w:keepLines/>
+        <w:spacing w:after="120"/>
+      </w:pPr>
+      <w:r>
+        <w:rPr>
+          <w:sz w:val="18"/>
+        </w:rPr>
+        <w:t>Certificate of Completion · October 16, 2026</w:t>
+        <w:br/>
+        <w:t xml:space="preserve">GenAI hypothesis-proposal drafting; proposal refinement through continued discovery. </w:t>
+      </w:r>
+      <w:hyperlink r:id="rId25">
+        <w:r>
+          <w:rPr>
+            <w:color w:val="245A81"/>
+            <w:sz w:val="17"/>
+          </w:rPr>
+          <w:t>View certificate</w:t>
+        </w:r>
+      </w:hyperlink>
+    </w:p>
+    <w:p>
+      <w:pPr>
+        <w:keepNext/>
+        <w:spacing w:after="20"/>
+      </w:pPr>
+      <w:r>
+        <w:rPr>
+          <w:b/>
+        </w:rPr>
+        <w:t>Cyber Job Simulation | Deloitte · Forage</w:t>
+      </w:r>
+    </w:p>
+    <w:p>
+      <w:pPr>
+        <w:keepLines/>
+        <w:spacing w:after="120"/>
+      </w:pPr>
+      <w:r>
+        <w:rPr>
+          <w:sz w:val="18"/>
+        </w:rPr>
+        <w:t>Certificate of Completion · October 16, 2026</w:t>
+        <w:br/>
+        <w:t xml:space="preserve">Practical tasks in cyber security. </w:t>
+      </w:r>
+      <w:hyperlink r:id="rId13">
+        <w:r>
+          <w:rPr>
+            <w:color w:val="245A81"/>
+            <w:sz w:val="17"/>
+          </w:rPr>
+          <w:t>View certificate</w:t>
+        </w:r>
+      </w:hyperlink>
     </w:p>
     <w:sectPr>
       <w:pgSz w:w="12240" w:h="15840"/>

</xml_diff>